<commit_message>
Pokoloruj strzałki na diagramie DAG i dodaj legendę
Co-Authored-By: Claude Opus 5.5 <noreply@anthropic.com>
Claude-Session: https://claude.ai/code/session_01W1W5NhLXtv7c8YtsJMjuj5
</commit_message>
<xml_diff>
--- a/warsztat_2/warsztat_2_odpowiedzi.docx
+++ b/warsztat_2/warsztat_2_odpowiedzi.docx
@@ -680,7 +680,7 @@
       <w:r>
         <w:drawing>
           <wp:inline distT="0" distB="0" distL="0" distR="0">
-            <wp:extent cx="5143500" cy="3495675"/>
+            <wp:extent cx="4953000" cy="3819525"/>
             <wp:effectExtent t="0" r="0" b="0" l="0"/>
             <wp:docPr id="1" name="" descr="" title=""/>
             <wp:cNvGraphicFramePr>
@@ -705,7 +705,7 @@
                   <pic:spPr bwMode="auto">
                     <a:xfrm>
                       <a:off x="0" y="0"/>
-                      <a:ext cx="5143500" cy="3495675"/>
+                      <a:ext cx="4953000" cy="3819525"/>
                     </a:xfrm>
                     <a:prstGeom prst="rect">
                       <a:avLst/>

</xml_diff>

<commit_message>
Użyj nazw z DAG w legendzie diagramu
Co-Authored-By: Claude Opus 5.5 <noreply@anthropic.com>
Claude-Session: https://claude.ai/code/session_01W1W5NhLXtv7c8YtsJMjuj5
</commit_message>
<xml_diff>
--- a/warsztat_2/warsztat_2_odpowiedzi.docx
+++ b/warsztat_2/warsztat_2_odpowiedzi.docx
@@ -680,7 +680,7 @@
       <w:r>
         <w:drawing>
           <wp:inline distT="0" distB="0" distL="0" distR="0">
-            <wp:extent cx="4953000" cy="3819525"/>
+            <wp:extent cx="5143500" cy="3705225"/>
             <wp:effectExtent t="0" r="0" b="0" l="0"/>
             <wp:docPr id="1" name="" descr="" title=""/>
             <wp:cNvGraphicFramePr>
@@ -705,7 +705,7 @@
                   <pic:spPr bwMode="auto">
                     <a:xfrm>
                       <a:off x="0" y="0"/>
-                      <a:ext cx="4953000" cy="3819525"/>
+                      <a:ext cx="5143500" cy="3705225"/>
                     </a:xfrm>
                     <a:prstGeom prst="rect">
                       <a:avLst/>

</xml_diff>

<commit_message>
Ogranicz diagram DAG do trzech kolorów strzałek
Co-Authored-By: Claude Opus 5.5 <noreply@anthropic.com>
Claude-Session: https://claude.ai/code/session_01W1W5NhLXtv7c8YtsJMjuj5
</commit_message>
<xml_diff>
--- a/warsztat_2/warsztat_2_odpowiedzi.docx
+++ b/warsztat_2/warsztat_2_odpowiedzi.docx
@@ -680,7 +680,7 @@
       <w:r>
         <w:drawing>
           <wp:inline distT="0" distB="0" distL="0" distR="0">
-            <wp:extent cx="5143500" cy="3705225"/>
+            <wp:extent cx="4762500" cy="3848100"/>
             <wp:effectExtent t="0" r="0" b="0" l="0"/>
             <wp:docPr id="1" name="" descr="" title=""/>
             <wp:cNvGraphicFramePr>
@@ -705,7 +705,7 @@
                   <pic:spPr bwMode="auto">
                     <a:xfrm>
                       <a:off x="0" y="0"/>
-                      <a:ext cx="5143500" cy="3705225"/>
+                      <a:ext cx="4762500" cy="3848100"/>
                     </a:xfrm>
                     <a:prstGeom prst="rect">
                       <a:avLst/>

</xml_diff>